<commit_message>
Fix logic.png missing in docx by setting height limit instead of width
</commit_message>
<xml_diff>
--- a/Ollama_Smart_Router_Documentation.docx
+++ b/Ollama_Smart_Router_Documentation.docx
@@ -73,7 +73,7 @@
       <w:r>
         <w:drawing>
           <wp:inline xmlns:a="http://schemas.openxmlformats.org/drawingml/2006/main" xmlns:pic="http://schemas.openxmlformats.org/drawingml/2006/picture">
-            <wp:extent cx="5486400" cy="4886325"/>
+            <wp:extent cx="5486400" cy="7503372"/>
             <wp:docPr id="1" name="Picture 1"/>
             <wp:cNvGraphicFramePr>
               <a:graphicFrameLocks noChangeAspect="1"/>
@@ -94,7 +94,7 @@
                   <pic:spPr>
                     <a:xfrm>
                       <a:off x="0" y="0"/>
-                      <a:ext cx="5486400" cy="4886325"/>
+                      <a:ext cx="5486400" cy="7503372"/>
                     </a:xfrm>
                     <a:prstGeom prst="rect"/>
                   </pic:spPr>
@@ -125,7 +125,7 @@
       <w:r>
         <w:drawing>
           <wp:inline xmlns:a="http://schemas.openxmlformats.org/drawingml/2006/main" xmlns:pic="http://schemas.openxmlformats.org/drawingml/2006/picture">
-            <wp:extent cx="5486400" cy="1106536"/>
+            <wp:extent cx="3056292" cy="5943600"/>
             <wp:docPr id="2" name="Picture 2"/>
             <wp:cNvGraphicFramePr>
               <a:graphicFrameLocks noChangeAspect="1"/>
@@ -146,7 +146,7 @@
                   <pic:spPr>
                     <a:xfrm>
                       <a:off x="0" y="0"/>
-                      <a:ext cx="5486400" cy="1106536"/>
+                      <a:ext cx="3056292" cy="5943600"/>
                     </a:xfrm>
                     <a:prstGeom prst="rect"/>
                   </pic:spPr>

</xml_diff>

<commit_message>
Update docx generator to include TOC, list of figures, tables and captions
</commit_message>
<xml_diff>
--- a/Ollama_Smart_Router_Documentation.docx
+++ b/Ollama_Smart_Router_Documentation.docx
@@ -9,6 +9,113 @@
       </w:pPr>
       <w:r>
         <w:t>TÀI LIỆU KỸ THUẬT: OLLAMA SMART ROUTER V4</w:t>
+      </w:r>
+    </w:p>
+    <w:p>
+      <w:pPr>
+        <w:pStyle w:val="Heading1"/>
+      </w:pPr>
+      <w:r>
+        <w:t>MỤC LỤC</w:t>
+      </w:r>
+    </w:p>
+    <w:p>
+      <w:r>
+        <w:t>1. Tổng quan các thảo luận</w:t>
+      </w:r>
+    </w:p>
+    <w:p>
+      <w:r>
+        <w:t>2. Kiến trúc hệ thống</w:t>
+      </w:r>
+    </w:p>
+    <w:p>
+      <w:r>
+        <w:t>3. Cơ chế Multi-Agent Cross-Check</w:t>
+      </w:r>
+    </w:p>
+    <w:p>
+      <w:r>
+        <w:t>4. Danh sách Models (Inventory)</w:t>
+      </w:r>
+    </w:p>
+    <w:p>
+      <w:r>
+        <w:t>5. Tools Tích Hợp (MCP)</w:t>
+      </w:r>
+    </w:p>
+    <w:p>
+      <w:r>
+        <w:t>6. Quản lý hệ thống tự động cài đặt</w:t>
+      </w:r>
+    </w:p>
+    <w:p>
+      <w:pPr>
+        <w:pStyle w:val="Heading1"/>
+      </w:pPr>
+      <w:r>
+        <w:t>DANH MỤC HÌNH ẢNH</w:t>
+      </w:r>
+    </w:p>
+    <w:p>
+      <w:r>
+        <w:t>Hình 1: Sơ đồ khối luồng xử lý và định tuyến từ Prompt của người dùng</w:t>
+      </w:r>
+    </w:p>
+    <w:p>
+      <w:r>
+        <w:t>Hình 2: Kiến trúc phân loại và kiểm tra chéo (Cross-Check) đa tác tử</w:t>
+      </w:r>
+    </w:p>
+    <w:p>
+      <w:pPr>
+        <w:pStyle w:val="Heading1"/>
+      </w:pPr>
+      <w:r>
+        <w:t>DANH MỤC BẢNG BIỂU</w:t>
+      </w:r>
+    </w:p>
+    <w:p>
+      <w:r>
+        <w:t>Bảng 1: Danh sách Models (Inventory)</w:t>
+      </w:r>
+    </w:p>
+    <w:p>
+      <w:r>
+        <w:t>Bảng 2: Tools Tích Hợp (MCP)</w:t>
+      </w:r>
+    </w:p>
+    <w:p>
+      <w:pPr>
+        <w:pStyle w:val="Heading1"/>
+      </w:pPr>
+      <w:r>
+        <w:t>DANH MỤC TỪ VIẾT TẮT</w:t>
+      </w:r>
+    </w:p>
+    <w:p>
+      <w:r>
+        <w:t>- AI: Artificial Intelligence</w:t>
+      </w:r>
+    </w:p>
+    <w:p>
+      <w:r>
+        <w:t>- MCP: Model Context Protocol</w:t>
+      </w:r>
+    </w:p>
+    <w:p>
+      <w:r>
+        <w:t>- VRAM: Video Random Access Memory</w:t>
+      </w:r>
+    </w:p>
+    <w:p>
+      <w:r>
+        <w:t>- TOC: Table of Contents</w:t>
+      </w:r>
+    </w:p>
+    <w:p>
+      <w:r>
+        <w:br w:type="page"/>
       </w:r>
     </w:p>
     <w:p>
@@ -107,6 +214,15 @@
     </w:p>
     <w:p>
       <w:pPr>
+        <w:pStyle w:val="Caption"/>
+        <w:jc w:val="center"/>
+      </w:pPr>
+      <w:r>
+        <w:t>Hình 1: Sơ đồ khối luồng xử lý và định tuyến từ Prompt của người dùng</w:t>
+      </w:r>
+    </w:p>
+    <w:p>
+      <w:pPr>
         <w:pStyle w:val="Heading1"/>
       </w:pPr>
       <w:r>
@@ -159,10 +275,27 @@
     </w:p>
     <w:p>
       <w:pPr>
+        <w:pStyle w:val="Caption"/>
+        <w:jc w:val="center"/>
+      </w:pPr>
+      <w:r>
+        <w:t>Hình 2: Kiến trúc phân loại và kiểm tra chéo (Cross-Check) đa tác tử</w:t>
+      </w:r>
+    </w:p>
+    <w:p>
+      <w:pPr>
         <w:pStyle w:val="Heading1"/>
       </w:pPr>
       <w:r>
         <w:t>4. Danh sách Models (Inventory)</w:t>
+      </w:r>
+    </w:p>
+    <w:p>
+      <w:pPr>
+        <w:jc w:val="center"/>
+      </w:pPr>
+      <w:r>
+        <w:t>Bảng 1: Danh sách Models (Inventory)</w:t>
       </w:r>
     </w:p>
     <w:tbl>
@@ -452,6 +585,14 @@
       </w:pPr>
       <w:r>
         <w:t>5. Tools Tích Hợp (MCP)</w:t>
+      </w:r>
+    </w:p>
+    <w:p>
+      <w:pPr>
+        <w:jc w:val="center"/>
+      </w:pPr>
+      <w:r>
+        <w:t>Bảng 2: Tools Tích Hợp (MCP)</w:t>
       </w:r>
     </w:p>
     <w:tbl>

</xml_diff>

<commit_message>
Add header, footer with page numbers, and dynamic TOC to docx
</commit_message>
<xml_diff>
--- a/Ollama_Smart_Router_Documentation.docx
+++ b/Ollama_Smart_Router_Documentation.docx
@@ -21,32 +21,10 @@
     </w:p>
     <w:p>
       <w:r>
-        <w:t>1. Tổng quan các thảo luận</w:t>
-      </w:r>
-    </w:p>
-    <w:p>
-      <w:r>
-        <w:t>2. Kiến trúc hệ thống</w:t>
-      </w:r>
-    </w:p>
-    <w:p>
-      <w:r>
-        <w:t>3. Cơ chế Multi-Agent Cross-Check</w:t>
-      </w:r>
-    </w:p>
-    <w:p>
-      <w:r>
-        <w:t>4. Danh sách Models (Inventory)</w:t>
-      </w:r>
-    </w:p>
-    <w:p>
-      <w:r>
-        <w:t>5. Tools Tích Hợp (MCP)</w:t>
-      </w:r>
-    </w:p>
-    <w:p>
-      <w:r>
-        <w:t>6. Quản lý hệ thống tự động cài đặt</w:t>
+        <w:fldChar w:fldCharType="begin"/>
+        <w:instrText xml:space="preserve">TOC \o "1-3" \h \z \u</w:instrText>
+        <w:fldChar w:fldCharType="separate"/>
+        <w:fldChar w:fldCharType="end"/>
       </w:r>
     </w:p>
     <w:p>
@@ -862,6 +840,8 @@
       </w:r>
     </w:p>
     <w:sectPr>
+      <w:headerReference w:type="default" r:id="rId11"/>
+      <w:footerReference w:type="default" r:id="rId12"/>
       <w:pgSz w:w="12240" w:h="15840"/>
       <w:pgMar w:top="1440" w:right="1800" w:bottom="1440" w:left="1800" w:header="720" w:footer="720" w:gutter="0"/>
       <w:cols w:space="720"/>
@@ -869,6 +849,40 @@
     </w:sectPr>
   </w:body>
 </w:document>
+</file>
+
+<file path=word/footer1.xml><?xml version="1.0" encoding="utf-8"?>
+<w:ftr xmlns:m="http://schemas.openxmlformats.org/officeDocument/2006/math" xmlns:mc="http://schemas.openxmlformats.org/markup-compatibility/2006" xmlns:mo="http://schemas.microsoft.com/office/mac/office/2008/main" xmlns:mv="urn:schemas-microsoft-com:mac:vml" xmlns:o="urn:schemas-microsoft-com:office:office" xmlns:r="http://schemas.openxmlformats.org/officeDocument/2006/relationships" xmlns:v="urn:schemas-microsoft-com:vml" xmlns:w10="urn:schemas-microsoft-com:office:word" xmlns:w14="http://schemas.microsoft.com/office/word/2010/wordml" xmlns:w="http://schemas.openxmlformats.org/wordprocessingml/2006/main" xmlns:wne="http://schemas.microsoft.com/office/word/2006/wordml" xmlns:wp14="http://schemas.microsoft.com/office/word/2010/wordprocessingDrawing" xmlns:wp="http://schemas.openxmlformats.org/drawingml/2006/wordprocessingDrawing" xmlns:wpc="http://schemas.microsoft.com/office/word/2010/wordprocessingCanvas" xmlns:wpg="http://schemas.microsoft.com/office/word/2010/wordprocessingGroup" xmlns:wpi="http://schemas.microsoft.com/office/word/2010/wordprocessingInk" xmlns:wps="http://schemas.microsoft.com/office/word/2010/wordprocessingShape" mc:Ignorable="w14 wp14">
+  <w:p>
+    <w:pPr>
+      <w:pStyle w:val="Footer"/>
+      <w:jc w:val="center"/>
+    </w:pPr>
+    <w:r>
+      <w:t xml:space="preserve">Trang </w:t>
+    </w:r>
+    <w:r>
+      <w:fldChar w:fldCharType="begin"/>
+      <w:instrText xml:space="preserve">PAGE</w:instrText>
+      <w:fldChar w:fldCharType="separate"/>
+      <w:fldChar w:fldCharType="end"/>
+    </w:r>
+  </w:p>
+</w:ftr>
+</file>
+
+<file path=word/header1.xml><?xml version="1.0" encoding="utf-8"?>
+<w:hdr xmlns:m="http://schemas.openxmlformats.org/officeDocument/2006/math" xmlns:mc="http://schemas.openxmlformats.org/markup-compatibility/2006" xmlns:mo="http://schemas.microsoft.com/office/mac/office/2008/main" xmlns:mv="urn:schemas-microsoft-com:mac:vml" xmlns:o="urn:schemas-microsoft-com:office:office" xmlns:r="http://schemas.openxmlformats.org/officeDocument/2006/relationships" xmlns:v="urn:schemas-microsoft-com:vml" xmlns:w10="urn:schemas-microsoft-com:office:word" xmlns:w14="http://schemas.microsoft.com/office/word/2010/wordml" xmlns:w="http://schemas.openxmlformats.org/wordprocessingml/2006/main" xmlns:wne="http://schemas.microsoft.com/office/word/2006/wordml" xmlns:wp14="http://schemas.microsoft.com/office/word/2010/wordprocessingDrawing" xmlns:wp="http://schemas.openxmlformats.org/drawingml/2006/wordprocessingDrawing" xmlns:wpc="http://schemas.microsoft.com/office/word/2010/wordprocessingCanvas" xmlns:wpg="http://schemas.microsoft.com/office/word/2010/wordprocessingGroup" xmlns:wpi="http://schemas.microsoft.com/office/word/2010/wordprocessingInk" xmlns:wps="http://schemas.microsoft.com/office/word/2010/wordprocessingShape" mc:Ignorable="w14 wp14">
+  <w:p>
+    <w:pPr>
+      <w:pStyle w:val="Header"/>
+      <w:jc w:val="right"/>
+    </w:pPr>
+    <w:r>
+      <w:t>Phạm Ngọc Bảy - Liên hệ Zalo: 0972290107</w:t>
+    </w:r>
+  </w:p>
+</w:hdr>
 </file>
 
 <file path=word/numbering.xml><?xml version="1.0" encoding="utf-8"?>

</xml_diff>